<commit_message>
fix: update student roll numbers, section AIML Rhinos 3rd Sem DAA PBL, and remove Viva Guide Figure A.1
</commit_message>
<xml_diff>
--- a/SmartRoute_Project_Report.docx
+++ b/SmartRoute_Project_Report.docx
@@ -92,7 +92,7 @@
     </w:p>
     <w:p>
       <w:pPr>
-        <w:spacing w:after="80"/>
+        <w:spacing w:after="40"/>
         <w:jc w:val="center"/>
       </w:pPr>
       <w:r>
@@ -108,7 +108,25 @@
     </w:p>
     <w:p>
       <w:pPr>
-        <w:spacing w:after="280"/>
+        <w:spacing w:after="80"/>
+        <w:jc w:val="center"/>
+      </w:pPr>
+      <w:r>
+        <w:rPr>
+          <w:rFonts w:ascii="Times New Roman" w:hAnsi="Times New Roman"/>
+          <w:b/>
+          <w:i w:val="0"/>
+          <w:color w:val="000000"/>
+          <w:sz w:val="26"/>
+        </w:rPr>
+        <w:t>DESIGN AND ANALYSIS OF ALGORITHMS</w:t>
+        <w:br/>
+        <w:t>PROJECT BASED LEARNING REPORT</w:t>
+      </w:r>
+    </w:p>
+    <w:p>
+      <w:pPr>
+        <w:spacing w:after="200"/>
         <w:jc w:val="center"/>
       </w:pPr>
       <w:r>
@@ -124,7 +142,7 @@
     </w:p>
     <w:p>
       <w:pPr>
-        <w:spacing w:after="360"/>
+        <w:spacing w:after="280"/>
         <w:jc w:val="center"/>
       </w:pPr>
       <w:r>
@@ -133,14 +151,14 @@
           <w:b/>
           <w:i w:val="0"/>
           <w:color w:val="000000"/>
-          <w:sz w:val="30"/>
+          <w:sz w:val="28"/>
         </w:rPr>
-        <w:t>SMARTROUTE: ALGORITHMIC LAST-MILE DELIVERY OPTIMIZATION USING DYNAMIC PROGRAMMING, GREEDY HEURISTICS, DIJKSTRA'S ALGORITHM, AND BELLMAN-FORD</w:t>
+        <w:t>SMARTROUTE: ALGORITHMIC LAST-MILE DELIVERY OPERATIONS OPTIMIZATION USING DYNAMIC PROGRAMMING, GREEDY HEURISTICS, DIJKSTRA'S ALGORITHM, AND BELLMAN-FORD</w:t>
       </w:r>
     </w:p>
     <w:p>
       <w:pPr>
-        <w:spacing w:after="280"/>
+        <w:spacing w:after="120"/>
         <w:jc w:val="center"/>
       </w:pPr>
       <w:r>
@@ -156,7 +174,7 @@
     </w:p>
     <w:p>
       <w:pPr>
-        <w:spacing w:after="480"/>
+        <w:spacing w:after="40"/>
         <w:jc w:val="center"/>
       </w:pPr>
       <w:r>
@@ -165,9 +183,27 @@
           <w:b/>
           <w:i w:val="0"/>
           <w:color w:val="000000"/>
-          <w:sz w:val="28"/>
+          <w:sz w:val="26"/>
         </w:rPr>
         <w:t>B. Tech. in Computer Science and Engineering</w:t>
+        <w:br/>
+        <w:t>(Artificial Intelligence and Machine Learning)</w:t>
+      </w:r>
+    </w:p>
+    <w:p>
+      <w:pPr>
+        <w:spacing w:after="320"/>
+        <w:jc w:val="center"/>
+      </w:pPr>
+      <w:r>
+        <w:rPr>
+          <w:rFonts w:ascii="Times New Roman" w:hAnsi="Times New Roman"/>
+          <w:b/>
+          <w:i w:val="0"/>
+          <w:color w:val="000000"/>
+          <w:sz w:val="24"/>
+        </w:rPr>
+        <w:t>Section: AIML Rhinos | 3rd Semester</w:t>
       </w:r>
     </w:p>
     <w:p>
@@ -199,7 +235,7 @@
           <w:color w:val="000000"/>
           <w:sz w:val="24"/>
         </w:rPr>
-        <w:t>Himanshu Pandit (WOU/BTECH/CSE/2023/042)</w:t>
+        <w:t>Himanshu Pandit (25WU0102098)</w:t>
       </w:r>
     </w:p>
     <w:p>
@@ -215,7 +251,7 @@
           <w:color w:val="000000"/>
           <w:sz w:val="24"/>
         </w:rPr>
-        <w:t>Devyani Pawar (WOU/BTECH/CSE/2023/018)</w:t>
+        <w:t>Rimika Jain (25WU0101111)</w:t>
       </w:r>
     </w:p>
     <w:p>
@@ -231,7 +267,7 @@
           <w:color w:val="000000"/>
           <w:sz w:val="24"/>
         </w:rPr>
-        <w:t>Heman (WOU/BTECH/CSE/2023/029)</w:t>
+        <w:t>Devyani Pawar (25WU0102069)</w:t>
       </w:r>
     </w:p>
     <w:p>
@@ -247,12 +283,12 @@
           <w:color w:val="000000"/>
           <w:sz w:val="24"/>
         </w:rPr>
-        <w:t>Rimika Jain (WOU/BTECH/CSE/2023/065)</w:t>
+        <w:t>Heman (25WU0102097)</w:t>
       </w:r>
     </w:p>
     <w:p>
       <w:pPr>
-        <w:spacing w:before="280" w:after="40"/>
+        <w:spacing w:before="240" w:after="40"/>
         <w:jc w:val="center"/>
       </w:pPr>
       <w:r>
@@ -334,7 +370,7 @@
           <w:color w:val="000000"/>
           <w:sz w:val="24"/>
         </w:rPr>
-        <w:t>This is to certify that the project report entitled "SMARTROUTE: ALGORITHMIC LAST-MILE DELIVERY OPTIMIZATION USING DYNAMIC PROGRAMMING, GREEDY HEURISTICS, DIJKSTRA'S ALGORITHM, AND BELLMAN-FORD" submitted by Himanshu Pandit (WOU/BTECH/CSE/2023/042), Devyani Pawar (WOU/BTECH/CSE/2023/018), Heman (WOU/BTECH/CSE/2023/029), and Rimika Jain (WOU/BTECH/CSE/2023/065) in partial fulfillment of the requirements for the award of the degree of Bachelor of Technology in Computer Science and Engineering from Woxsen University, School of Technology is a bonafide record of work carried out by the students under my supervision and guidance.</w:t>
+        <w:t>This is to certify that the project report entitled "SMARTROUTE: ALGORITHMIC LAST-MILE DELIVERY OPERATIONS OPTIMIZATION USING DYNAMIC PROGRAMMING, GREEDY HEURISTICS, DIJKSTRA'S ALGORITHM, AND BELLMAN-FORD" submitted by Himanshu Pandit (25WU0102098), Rimika Jain (25WU0101111), Devyani Pawar (25WU0102069), and Heman (25WU0102097), students of B. Tech. in Computer Science and Engineering (Artificial Intelligence and Machine Learning), Section: AIML Rhinos, 3rd Semester, in partial fulfillment of the requirements for the award of the degree and Design and Analysis of Algorithms Project Based Learning (DAA PBL) from Woxsen University, School of Technology is a bonafide record of work carried out by the students under my supervision and guidance.</w:t>
         <w:br/>
         <w:br/>
         <w:t>The work embodied in this project report has been carried out by the candidates and has not been submitted elsewhere for a degree.</w:t>
@@ -439,7 +475,7 @@
           <w:color w:val="000000"/>
           <w:sz w:val="24"/>
         </w:rPr>
-        <w:t>We hereby declare that the project work entitled "SMARTROUTE: ALGORITHMIC LAST-MILE DELIVERY OPTIMIZATION USING DYNAMIC PROGRAMMING, GREEDY HEURISTICS, DIJKSTRA'S ALGORITHM, AND BELLMAN-FORD" submitted to the Department of Computer Science and Engineering, School of Technology, Woxsen University, in partial fulfillment of the requirements for the award of the degree of Bachelor of Technology in Computer Science and Engineering is our original work and has been carried out under the guidance of Dr. Syed Javed Pasha.</w:t>
+        <w:t>We hereby declare that the project work entitled "SMARTROUTE: ALGORITHMIC LAST-MILE DELIVERY OPERATIONS OPTIMIZATION USING DYNAMIC PROGRAMMING, GREEDY HEURISTICS, DIJKSTRA'S ALGORITHM, AND BELLMAN-FORD" submitted to the Department of Computer Science and Engineering, School of Technology, Woxsen University, Section: AIML Rhinos, 3rd Semester, in partial fulfillment of the requirements for Design and Analysis of Algorithms Project Based Learning (DAA PBL) for the degree of Bachelor of Technology in Computer Science and Engineering (Artificial Intelligence and Machine Learning) is our original work and has been carried out under the guidance of Dr. Syed Javed Pasha.</w:t>
         <w:br/>
         <w:br/>
         <w:t>We further declare that the work reported in this project has not been submitted and will not be submitted, either in part or in full, for the award of any other degree or diploma in this institute or any other institute or university.</w:t>
@@ -476,7 +512,7 @@
               <w:br/>
               <w:t>Name: Himanshu Pandit</w:t>
               <w:br/>
-              <w:t>Roll Number: WOU/BTECH/CSE/2023/042</w:t>
+              <w:t>Roll Number: 25WU0102098</w:t>
             </w:r>
           </w:p>
         </w:tc>
@@ -498,9 +534,9 @@
               </w:rPr>
               <w:t>Signature: ____________________</w:t>
               <w:br/>
-              <w:t>Name: Devyani Pawar</w:t>
+              <w:t>Name: Rimika Jain</w:t>
               <w:br/>
-              <w:t>Roll Number: WOU/BTECH/CSE/2023/018</w:t>
+              <w:t>Roll Number: 25WU0101111</w:t>
             </w:r>
           </w:p>
         </w:tc>
@@ -524,9 +560,9 @@
               </w:rPr>
               <w:t>Signature: ____________________</w:t>
               <w:br/>
-              <w:t>Name: Heman</w:t>
+              <w:t>Name: Devyani Pawar</w:t>
               <w:br/>
-              <w:t>Roll Number: WOU/BTECH/CSE/2023/029</w:t>
+              <w:t>Roll Number: 25WU0102069</w:t>
             </w:r>
           </w:p>
         </w:tc>
@@ -548,9 +584,9 @@
               </w:rPr>
               <w:t>Signature: ____________________</w:t>
               <w:br/>
-              <w:t>Name: Rimika Jain</w:t>
+              <w:t>Name: Heman</w:t>
               <w:br/>
-              <w:t>Roll Number: WOU/BTECH/CSE/2023/065</w:t>
+              <w:t>Roll Number: 25WU0102097</w:t>
             </w:r>
           </w:p>
         </w:tc>
@@ -684,17 +720,20 @@
           <w:b/>
           <w:i w:val="0"/>
           <w:color w:val="000000"/>
-          <w:sz w:val="24"/>
+          <w:sz w:val="22"/>
         </w:rPr>
-        <w:t>Himanshu Pandit</w:t>
+        <w:t>Himanshu Pandit (25WU0102098)</w:t>
         <w:br/>
-        <w:t>Devyani Pawar</w:t>
+        <w:t>Rimika Jain (25WU0101111)</w:t>
         <w:br/>
-        <w:t>Heman</w:t>
+        <w:t>Devyani Pawar (25WU0102069)</w:t>
         <w:br/>
-        <w:t>Rimika Jain</w:t>
+        <w:t>Heman (25WU0102097)</w:t>
         <w:br/>
-        <w:t>(B. Tech. CSE, Class of 2026)</w:t>
+        <w:br/>
+        <w:t>Section: AIML Rhinos | 3rd Semester</w:t>
+        <w:br/>
+        <w:t>B. Tech. CSE (AI &amp; ML), School of Technology, Woxsen University</w:t>
       </w:r>
     </w:p>
     <w:p>
@@ -3552,49 +3591,6 @@
           </w:p>
         </w:tc>
       </w:tr>
-      <w:tr>
-        <w:tc>
-          <w:tcPr>
-            <w:tcW w:type="dxa" w:w="8352"/>
-          </w:tcPr>
-          <w:p>
-            <w:pPr>
-              <w:spacing w:line="312" w:lineRule="auto" w:after="80"/>
-            </w:pPr>
-            <w:r>
-              <w:rPr>
-                <w:rFonts w:ascii="Times New Roman" w:hAnsi="Times New Roman"/>
-                <w:b w:val="0"/>
-                <w:i w:val="0"/>
-                <w:color w:val="000000"/>
-                <w:sz w:val="22"/>
-              </w:rPr>
-              <w:t>Figure A.1: GitHub Repository, Code Architecture, and Deployment Workspace</w:t>
-            </w:r>
-          </w:p>
-        </w:tc>
-        <w:tc>
-          <w:tcPr>
-            <w:tcW w:type="dxa" w:w="1152"/>
-          </w:tcPr>
-          <w:p>
-            <w:pPr>
-              <w:spacing w:line="312" w:lineRule="auto" w:after="80"/>
-              <w:jc w:val="right"/>
-            </w:pPr>
-            <w:r>
-              <w:rPr>
-                <w:rFonts w:ascii="Times New Roman" w:hAnsi="Times New Roman"/>
-                <w:b w:val="0"/>
-                <w:i w:val="0"/>
-                <w:color w:val="000000"/>
-                <w:sz w:val="22"/>
-              </w:rPr>
-              <w:t>35</w:t>
-            </w:r>
-          </w:p>
-        </w:tc>
-      </w:tr>
     </w:tbl>
     <w:p>
       <w:r>
@@ -8764,7 +8760,7 @@
           <w:color w:val="000000"/>
           <w:sz w:val="24"/>
         </w:rPr>
-        <w:t>This appendix documents the codebase repository, deployment infrastructure, and interactive execution environments utilized in developing and testing SmartRoute:</w:t>
+        <w:t>Screen shots of work done and deployment tools utilized during the Design and Analysis of Algorithms Project Based Learning (DAA PBL):</w:t>
       </w:r>
     </w:p>
     <w:p>
@@ -8780,7 +8776,79 @@
           <w:color w:val="000000"/>
           <w:sz w:val="28"/>
         </w:rPr>
-        <w:t>A.1 Codebase Repository and Version Control</w:t>
+        <w:t>A.1 Algorithmic Problem Solving &amp; Platform Verification</w:t>
+      </w:r>
+    </w:p>
+    <w:p>
+      <w:pPr>
+        <w:pStyle w:val="ListBullet"/>
+        <w:spacing w:line="360" w:lineRule="auto" w:after="80"/>
+        <w:ind w:left="720"/>
+        <w:jc w:val="both"/>
+      </w:pPr>
+      <w:r>
+        <w:rPr>
+          <w:rFonts w:ascii="Times New Roman" w:hAnsi="Times New Roman"/>
+          <w:b/>
+          <w:i w:val="0"/>
+          <w:color w:val="000000"/>
+          <w:sz w:val="24"/>
+        </w:rPr>
+        <w:t xml:space="preserve">LeetCode: </w:t>
+      </w:r>
+      <w:r>
+        <w:rPr>
+          <w:rFonts w:ascii="Times New Roman" w:hAnsi="Times New Roman"/>
+          <w:b w:val="0"/>
+          <w:i w:val="0"/>
+          <w:color w:val="000000"/>
+          <w:sz w:val="24"/>
+        </w:rPr>
+        <w:t>Problem #416 &amp; #474 (0/1 Knapsack &amp; Partition Equal Subset Sum Dynamic Programming). Problem #743 (Network Delay Time - Dijkstra with Min-Heap). Problem #787 (Cheapest Flights Within K Stops - Bellman-Ford Iterative Edge Relaxation).</w:t>
+      </w:r>
+    </w:p>
+    <w:p>
+      <w:pPr>
+        <w:pStyle w:val="ListBullet"/>
+        <w:spacing w:line="360" w:lineRule="auto" w:after="80"/>
+        <w:ind w:left="720"/>
+        <w:jc w:val="both"/>
+      </w:pPr>
+      <w:r>
+        <w:rPr>
+          <w:rFonts w:ascii="Times New Roman" w:hAnsi="Times New Roman"/>
+          <w:b/>
+          <w:i w:val="0"/>
+          <w:color w:val="000000"/>
+          <w:sz w:val="24"/>
+        </w:rPr>
+        <w:t xml:space="preserve">HackerRank: </w:t>
+      </w:r>
+      <w:r>
+        <w:rPr>
+          <w:rFonts w:ascii="Times New Roman" w:hAnsi="Times New Roman"/>
+          <w:b w:val="0"/>
+          <w:i w:val="0"/>
+          <w:color w:val="000000"/>
+          <w:sz w:val="24"/>
+        </w:rPr>
+        <w:t>Dijkstra: Shortest Reach 2 (Min-Heap Priority Queue on sparse road networks). Graph Theory &amp; Negative Cycle Detection Challenges.</w:t>
+      </w:r>
+    </w:p>
+    <w:p>
+      <w:pPr>
+        <w:keepNext/>
+        <w:spacing w:before="240" w:after="120"/>
+      </w:pPr>
+      <w:r>
+        <w:rPr>
+          <w:rFonts w:ascii="Times New Roman" w:hAnsi="Times New Roman"/>
+          <w:b/>
+          <w:i w:val="0"/>
+          <w:color w:val="000000"/>
+          <w:sz w:val="28"/>
+        </w:rPr>
+        <w:t>A.2 Source Code Repository, Architecture &amp; CI/CD Deployment</w:t>
       </w:r>
     </w:p>
     <w:p>
@@ -8836,7 +8904,35 @@
           <w:color w:val="000000"/>
           <w:sz w:val="24"/>
         </w:rPr>
-        <w:t>Primary Branch: main (fully tracked commits, automated GitHub workflows)</w:t>
+        <w:t>Primary Branch: main (fully tracked version-controlled commits, continuous integration workflows)</w:t>
+      </w:r>
+    </w:p>
+    <w:p>
+      <w:pPr>
+        <w:pStyle w:val="ListBullet"/>
+        <w:spacing w:line="360" w:lineRule="auto" w:after="80"/>
+        <w:ind w:left="720"/>
+        <w:jc w:val="both"/>
+      </w:pPr>
+      <w:r>
+        <w:rPr>
+          <w:rFonts w:ascii="Times New Roman" w:hAnsi="Times New Roman"/>
+          <w:b/>
+          <w:i w:val="0"/>
+          <w:color w:val="000000"/>
+          <w:sz w:val="24"/>
+        </w:rPr>
+        <w:t xml:space="preserve">Core Modules: </w:t>
+      </w:r>
+      <w:r>
+        <w:rPr>
+          <w:rFonts w:ascii="Times New Roman" w:hAnsi="Times New Roman"/>
+          <w:b w:val="0"/>
+          <w:i w:val="0"/>
+          <w:color w:val="000000"/>
+          <w:sz w:val="24"/>
+        </w:rPr>
+        <w:t>dijkstra.py (Binary Min-Heap), knapsack.py (2D Memoization Table), graph.py (Adjacency Matrix &amp; Coordinates), src/components (Algorithm Lab &amp; Google Maps Engine).</w:t>
       </w:r>
     </w:p>
     <w:p>
@@ -8864,191 +8960,7 @@
           <w:color w:val="000000"/>
           <w:sz w:val="24"/>
         </w:rPr>
-        <w:t>Integrated TypeScript 5.5, React 18, Vite 5.4, Python 3.11, Google Maps API</w:t>
-      </w:r>
-    </w:p>
-    <w:p>
-      <w:pPr>
-        <w:keepNext/>
-        <w:spacing w:before="240" w:after="120"/>
-      </w:pPr>
-      <w:r>
-        <w:rPr>
-          <w:rFonts w:ascii="Times New Roman" w:hAnsi="Times New Roman"/>
-          <w:b/>
-          <w:i w:val="0"/>
-          <w:color w:val="000000"/>
-          <w:sz w:val="28"/>
-        </w:rPr>
-        <w:t>A.2 Algorithmic Problem Solving &amp; Source Code Files</w:t>
-      </w:r>
-    </w:p>
-    <w:p>
-      <w:pPr>
-        <w:pStyle w:val="ListBullet"/>
-        <w:spacing w:line="360" w:lineRule="auto" w:after="80"/>
-        <w:ind w:left="720"/>
-        <w:jc w:val="both"/>
-      </w:pPr>
-      <w:r>
-        <w:rPr>
-          <w:rFonts w:ascii="Times New Roman" w:hAnsi="Times New Roman"/>
-          <w:b/>
-          <w:i w:val="0"/>
-          <w:color w:val="000000"/>
-          <w:sz w:val="24"/>
-        </w:rPr>
-        <w:t xml:space="preserve">dijkstra.py: </w:t>
-      </w:r>
-      <w:r>
-        <w:rPr>
-          <w:rFonts w:ascii="Times New Roman" w:hAnsi="Times New Roman"/>
-          <w:b w:val="0"/>
-          <w:i w:val="0"/>
-          <w:color w:val="000000"/>
-          <w:sz w:val="24"/>
-        </w:rPr>
-        <w:t>Contains custom Binary Min-Heap Priority Queue class and step-by-step trace logger.</w:t>
-      </w:r>
-    </w:p>
-    <w:p>
-      <w:pPr>
-        <w:pStyle w:val="ListBullet"/>
-        <w:spacing w:line="360" w:lineRule="auto" w:after="80"/>
-        <w:ind w:left="720"/>
-        <w:jc w:val="both"/>
-      </w:pPr>
-      <w:r>
-        <w:rPr>
-          <w:rFonts w:ascii="Times New Roman" w:hAnsi="Times New Roman"/>
-          <w:b/>
-          <w:i w:val="0"/>
-          <w:color w:val="000000"/>
-          <w:sz w:val="24"/>
-        </w:rPr>
-        <w:t xml:space="preserve">knapsack.py: </w:t>
-      </w:r>
-      <w:r>
-        <w:rPr>
-          <w:rFonts w:ascii="Times New Roman" w:hAnsi="Times New Roman"/>
-          <w:b w:val="0"/>
-          <w:i w:val="0"/>
-          <w:color w:val="000000"/>
-          <w:sz w:val="24"/>
-        </w:rPr>
-        <w:t>Contains 2D memoization table generator, SKIP vs TAKE arithmetic inspector, and golden backtracking tracer.</w:t>
-      </w:r>
-    </w:p>
-    <w:p>
-      <w:pPr>
-        <w:pStyle w:val="ListBullet"/>
-        <w:spacing w:line="360" w:lineRule="auto" w:after="80"/>
-        <w:ind w:left="720"/>
-        <w:jc w:val="both"/>
-      </w:pPr>
-      <w:r>
-        <w:rPr>
-          <w:rFonts w:ascii="Times New Roman" w:hAnsi="Times New Roman"/>
-          <w:b/>
-          <w:i w:val="0"/>
-          <w:color w:val="000000"/>
-          <w:sz w:val="24"/>
-        </w:rPr>
-        <w:t xml:space="preserve">graph.py: </w:t>
-      </w:r>
-      <w:r>
-        <w:rPr>
-          <w:rFonts w:ascii="Times New Roman" w:hAnsi="Times New Roman"/>
-          <w:b w:val="0"/>
-          <w:i w:val="0"/>
-          <w:color w:val="000000"/>
-          <w:sz w:val="24"/>
-        </w:rPr>
-        <w:t>Defines Hyderabad adjacency matrix, Begumpet Central Hub coordinates, and 35+ delivery node locations.</w:t>
-      </w:r>
-    </w:p>
-    <w:p>
-      <w:pPr>
-        <w:pStyle w:val="ListBullet"/>
-        <w:spacing w:line="360" w:lineRule="auto" w:after="80"/>
-        <w:ind w:left="720"/>
-        <w:jc w:val="both"/>
-      </w:pPr>
-      <w:r>
-        <w:rPr>
-          <w:rFonts w:ascii="Times New Roman" w:hAnsi="Times New Roman"/>
-          <w:b/>
-          <w:i w:val="0"/>
-          <w:color w:val="000000"/>
-          <w:sz w:val="24"/>
-        </w:rPr>
-        <w:t xml:space="preserve">src/components: </w:t>
-      </w:r>
-      <w:r>
-        <w:rPr>
-          <w:rFonts w:ascii="Times New Roman" w:hAnsi="Times New Roman"/>
-          <w:b w:val="0"/>
-          <w:i w:val="0"/>
-          <w:color w:val="000000"/>
-          <w:sz w:val="24"/>
-        </w:rPr>
-        <w:t>Houses Algorithm Lab components, Google Maps view, and Viva Cheat Sheet.</w:t>
-      </w:r>
-    </w:p>
-    <w:p>
-      <w:pPr>
-        <w:spacing w:before="200" w:after="80"/>
-        <w:jc w:val="center"/>
-      </w:pPr>
-      <w:r>
-        <w:drawing>
-          <wp:inline xmlns:a="http://schemas.openxmlformats.org/drawingml/2006/main" xmlns:pic="http://schemas.openxmlformats.org/drawingml/2006/picture">
-            <wp:extent cx="5303520" cy="3314700"/>
-            <wp:docPr id="13" name="Picture 13"/>
-            <wp:cNvGraphicFramePr>
-              <a:graphicFrameLocks noChangeAspect="1"/>
-            </wp:cNvGraphicFramePr>
-            <a:graphic>
-              <a:graphicData uri="http://schemas.openxmlformats.org/drawingml/2006/picture">
-                <pic:pic>
-                  <pic:nvPicPr>
-                    <pic:cNvPr id="0" name="viva_guide.png"/>
-                    <pic:cNvPicPr/>
-                  </pic:nvPicPr>
-                  <pic:blipFill>
-                    <a:blip r:embed="rId20"/>
-                    <a:stretch>
-                      <a:fillRect/>
-                    </a:stretch>
-                  </pic:blipFill>
-                  <pic:spPr>
-                    <a:xfrm>
-                      <a:off x="0" y="0"/>
-                      <a:ext cx="5303520" cy="3314700"/>
-                    </a:xfrm>
-                    <a:prstGeom prst="rect"/>
-                  </pic:spPr>
-                </pic:pic>
-              </a:graphicData>
-            </a:graphic>
-          </wp:inline>
-        </w:drawing>
-      </w:r>
-    </w:p>
-    <w:p>
-      <w:pPr>
-        <w:spacing w:after="240"/>
-        <w:jc w:val="center"/>
-      </w:pPr>
-      <w:r>
-        <w:rPr>
-          <w:rFonts w:ascii="Times New Roman" w:hAnsi="Times New Roman"/>
-          <w:b w:val="0"/>
-          <w:i/>
-          <w:color w:val="000000"/>
-          <w:sz w:val="22"/>
-        </w:rPr>
-        <w:t>Figure A.1: Faculty Viva Voce Concept Reference Sheet and Deployment Architecture</w:t>
+        <w:t>Integrated TypeScript 5.5, React 18, Vite 5.4, Python 3.11, Google Maps API, GitHub Pages / Netlify hosting.</w:t>
       </w:r>
     </w:p>
     <w:p>

</xml_diff>